<commit_message>
feat: otimização do fluxo de distribuição e visibilidade de responsabilidades - Melhora UI/UX do Modal de Distribuição com design premium e padronização da terminologia Defensor. - Adiciona nome da assistida em feedbacks visuais (toasts) para facilitar a identificação imediata. - Expande o Dashboard com nova coluna detalhando Analista (servidor/estagiário) vs Defensor (protocolo). - Exibe o analista responsável no cabeçalho da página de Detalhes do Caso. - Remove restrição de visibilidade do status 'em_protocolo' para servidores e estagiários (Cargo Nível 0). - Refina notificações de encaminhamento no backend com atribuição clara de cargo e nome do remetente. - Garante conformidade com LGPD mantendo PII (nomes) fora dos logs persistentes e notificações no banco.
</commit_message>
<xml_diff>
--- a/backend/templates/nos_autos_cumulado.docx
+++ b/backend/templates/nos_autos_cumulado.docx
@@ -17,7 +17,15 @@
           <w:b/>
           <w:bCs/>
         </w:rPr>
-        <w:t xml:space="preserve">JUIZ(A) DE DIREITO DA </w:t>
+        <w:t>AO JUÍZO</w:t>
+      </w:r>
+      <w:r>
+        <w:rPr>
+          <w:rFonts w:ascii="Garamond" w:hAnsi="Garamond"/>
+          <w:b/>
+          <w:bCs/>
+        </w:rPr>
+        <w:t xml:space="preserve"> DA </w:t>
       </w:r>
       <w:r>
         <w:rPr>

</xml_diff>